<commit_message>
update plotly express to plotly
</commit_message>
<xml_diff>
--- a/CS 340 README.docx
+++ b/CS 340 README.docx
@@ -200,55 +200,7 @@
           <w:rFonts w:eastAsia="Times New Roman" w:cstheme="minorHAnsi"/>
           <w:color w:val="000000" w:themeColor="text1"/>
         </w:rPr>
-        <w:t xml:space="preserve">: All database functionalities are provided by MongoDB. MongoDB serves as the "Model" component of the MVC pattern. Using the </w:t>
-      </w:r>
-      <w:proofErr w:type="spellStart"/>
-      <w:r>
-        <w:rPr>
-          <w:rFonts w:eastAsia="Times New Roman" w:cstheme="minorHAnsi"/>
-          <w:color w:val="000000" w:themeColor="text1"/>
-        </w:rPr>
-        <w:t>PyMongo</w:t>
-      </w:r>
-      <w:proofErr w:type="spellEnd"/>
-      <w:r>
-        <w:rPr>
-          <w:rFonts w:eastAsia="Times New Roman" w:cstheme="minorHAnsi"/>
-          <w:color w:val="000000" w:themeColor="text1"/>
-        </w:rPr>
-        <w:t xml:space="preserve"> driver allows for Python-native, dictionary-based queries that closely mirror </w:t>
-      </w:r>
-      <w:proofErr w:type="spellStart"/>
-      <w:r>
-        <w:rPr>
-          <w:rFonts w:eastAsia="Times New Roman" w:cstheme="minorHAnsi"/>
-          <w:color w:val="000000" w:themeColor="text1"/>
-        </w:rPr>
-        <w:t>mongosh</w:t>
-      </w:r>
-      <w:proofErr w:type="spellEnd"/>
-      <w:r>
-        <w:rPr>
-          <w:rFonts w:eastAsia="Times New Roman" w:cstheme="minorHAnsi"/>
-          <w:color w:val="000000" w:themeColor="text1"/>
-        </w:rPr>
-        <w:t xml:space="preserve"> syntax. While the interface is encapsulated via the </w:t>
-      </w:r>
-      <w:proofErr w:type="spellStart"/>
-      <w:r>
-        <w:rPr>
-          <w:rFonts w:eastAsia="Times New Roman" w:cstheme="minorHAnsi"/>
-          <w:color w:val="000000" w:themeColor="text1"/>
-        </w:rPr>
-        <w:t>AnimalShelter</w:t>
-      </w:r>
-      <w:proofErr w:type="spellEnd"/>
-      <w:r>
-        <w:rPr>
-          <w:rFonts w:eastAsia="Times New Roman" w:cstheme="minorHAnsi"/>
-          <w:color w:val="000000" w:themeColor="text1"/>
-        </w:rPr>
-        <w:t xml:space="preserve"> DAO, querying is made highly efficient. For example, filtering </w:t>
+        <w:t xml:space="preserve">: All database functionalities are provided by MongoDB. MongoDB serves as the "Model" component of the MVC pattern. Using the PyMongo driver allows for Python-native, dictionary-based queries that closely mirror mongosh syntax. While the interface is encapsulated via the AnimalShelter DAO, querying is made highly efficient. For example, filtering </w:t>
       </w:r>
       <w:r>
         <w:rPr>
@@ -256,55 +208,7 @@
           <w:color w:val="000000" w:themeColor="text1"/>
         </w:rPr>
         <w:lastRenderedPageBreak/>
-        <w:t>requires simply passing a dictionary populated with our required values (e.g</w:t>
-      </w:r>
-      <w:proofErr w:type="gramStart"/>
-      <w:r>
-        <w:rPr>
-          <w:rFonts w:eastAsia="Times New Roman" w:cstheme="minorHAnsi"/>
-          <w:color w:val="000000" w:themeColor="text1"/>
-        </w:rPr>
-        <w:t>., {</w:t>
-      </w:r>
-      <w:proofErr w:type="gramEnd"/>
-      <w:r>
-        <w:rPr>
-          <w:rFonts w:eastAsia="Times New Roman" w:cstheme="minorHAnsi"/>
-          <w:color w:val="000000" w:themeColor="text1"/>
-        </w:rPr>
-        <w:t>"</w:t>
-      </w:r>
-      <w:proofErr w:type="spellStart"/>
-      <w:r>
-        <w:rPr>
-          <w:rFonts w:eastAsia="Times New Roman" w:cstheme="minorHAnsi"/>
-          <w:color w:val="000000" w:themeColor="text1"/>
-        </w:rPr>
-        <w:t>animal_type</w:t>
-      </w:r>
-      <w:proofErr w:type="spellEnd"/>
-      <w:r>
-        <w:rPr>
-          <w:rFonts w:eastAsia="Times New Roman" w:cstheme="minorHAnsi"/>
-          <w:color w:val="000000" w:themeColor="text1"/>
-        </w:rPr>
-        <w:t>": "</w:t>
-      </w:r>
-      <w:proofErr w:type="gramStart"/>
-      <w:r>
-        <w:rPr>
-          <w:rFonts w:eastAsia="Times New Roman" w:cstheme="minorHAnsi"/>
-          <w:color w:val="000000" w:themeColor="text1"/>
-        </w:rPr>
-        <w:t>Dog"}</w:t>
-      </w:r>
-      <w:proofErr w:type="gramEnd"/>
-      <w:r>
-        <w:rPr>
-          <w:rFonts w:eastAsia="Times New Roman" w:cstheme="minorHAnsi"/>
-          <w:color w:val="000000" w:themeColor="text1"/>
-        </w:rPr>
-        <w:t>), which is far more streamlined than writing raw SQL strings.</w:t>
+        <w:t>requires simply passing a dictionary populated with our required values (e.g., {"animal_type": "Dog"}), which is far more streamlined than writing raw SQL strings.</w:t>
       </w:r>
     </w:p>
     <w:p>
@@ -334,39 +238,7 @@
           <w:rFonts w:eastAsia="Times New Roman" w:cstheme="minorHAnsi"/>
           <w:color w:val="000000" w:themeColor="text1"/>
         </w:rPr>
-        <w:t xml:space="preserve">: Dash provides </w:t>
-      </w:r>
-      <w:proofErr w:type="gramStart"/>
-      <w:r>
-        <w:rPr>
-          <w:rFonts w:eastAsia="Times New Roman" w:cstheme="minorHAnsi"/>
-          <w:color w:val="000000" w:themeColor="text1"/>
-        </w:rPr>
-        <w:t>the</w:t>
-      </w:r>
-      <w:proofErr w:type="gramEnd"/>
-      <w:r>
-        <w:rPr>
-          <w:rFonts w:eastAsia="Times New Roman" w:cstheme="minorHAnsi"/>
-          <w:color w:val="000000" w:themeColor="text1"/>
-        </w:rPr>
-        <w:t xml:space="preserve"> web server and </w:t>
-      </w:r>
-      <w:proofErr w:type="gramStart"/>
-      <w:r>
-        <w:rPr>
-          <w:rFonts w:eastAsia="Times New Roman" w:cstheme="minorHAnsi"/>
-          <w:color w:val="000000" w:themeColor="text1"/>
-        </w:rPr>
-        <w:t>the</w:t>
-      </w:r>
-      <w:proofErr w:type="gramEnd"/>
-      <w:r>
-        <w:rPr>
-          <w:rFonts w:eastAsia="Times New Roman" w:cstheme="minorHAnsi"/>
-          <w:color w:val="000000" w:themeColor="text1"/>
-        </w:rPr>
-        <w:t xml:space="preserve"> reactive application framework. It serves as both the "View" (the UI layout) and the "Controller" (the callbacks that process user input). It enabled the creation of an instantaneous, responsive application without requiring JavaScript. Furthermore, this backend-driven approach mitigates frontend data manipulation risks, as the data is securely refreshed from the backend on every request.</w:t>
+        <w:t>: Dash provides the web server and the reactive application framework. It serves as both the "View" (the UI layout) and the "Controller" (the callbacks that process user input). It enabled the creation of an instantaneous, responsive application without requiring JavaScript. Furthermore, this backend-driven approach mitigates frontend data manipulation risks, as the data is securely refreshed from the backend on every request.</w:t>
       </w:r>
     </w:p>
     <w:p>
@@ -412,7 +284,6 @@
           <w:color w:val="000000" w:themeColor="text1"/>
         </w:rPr>
       </w:pPr>
-      <w:proofErr w:type="spellStart"/>
       <w:r>
         <w:rPr>
           <w:rFonts w:eastAsia="Times New Roman" w:cstheme="minorHAnsi"/>
@@ -422,58 +293,12 @@
         </w:rPr>
         <w:t>Plotly</w:t>
       </w:r>
-      <w:proofErr w:type="spellEnd"/>
-      <w:r>
-        <w:rPr>
-          <w:rFonts w:eastAsia="Times New Roman" w:cstheme="minorHAnsi"/>
-          <w:b/>
-          <w:bCs/>
-          <w:color w:val="000000" w:themeColor="text1"/>
-        </w:rPr>
-        <w:t xml:space="preserve"> Express (</w:t>
-      </w:r>
-      <w:proofErr w:type="spellStart"/>
-      <w:r>
-        <w:rPr>
-          <w:rFonts w:eastAsia="Times New Roman" w:cstheme="minorHAnsi"/>
-          <w:b/>
-          <w:bCs/>
-          <w:color w:val="000000" w:themeColor="text1"/>
-        </w:rPr>
-        <w:t>Pyplot</w:t>
-      </w:r>
-      <w:proofErr w:type="spellEnd"/>
-      <w:r>
-        <w:rPr>
-          <w:rFonts w:eastAsia="Times New Roman" w:cstheme="minorHAnsi"/>
-          <w:b/>
-          <w:bCs/>
-          <w:color w:val="000000" w:themeColor="text1"/>
-        </w:rPr>
-        <w:t>)</w:t>
-      </w:r>
-      <w:r>
-        <w:rPr>
-          <w:rFonts w:eastAsia="Times New Roman" w:cstheme="minorHAnsi"/>
-          <w:color w:val="000000" w:themeColor="text1"/>
-        </w:rPr>
-        <w:t xml:space="preserve">: Drawing data graphics typically requires vast amounts of boilerplate code. </w:t>
-      </w:r>
-      <w:proofErr w:type="spellStart"/>
-      <w:r>
-        <w:rPr>
-          <w:rFonts w:eastAsia="Times New Roman" w:cstheme="minorHAnsi"/>
-          <w:color w:val="000000" w:themeColor="text1"/>
-        </w:rPr>
-        <w:t>Plotly</w:t>
-      </w:r>
-      <w:proofErr w:type="spellEnd"/>
-      <w:r>
-        <w:rPr>
-          <w:rFonts w:eastAsia="Times New Roman" w:cstheme="minorHAnsi"/>
-          <w:color w:val="000000" w:themeColor="text1"/>
-        </w:rPr>
-        <w:t xml:space="preserve"> Express simplified this process, allowing for the generation of interactive, highly customizable charts with just a few lines of code.</w:t>
+      <w:r>
+        <w:rPr>
+          <w:rFonts w:eastAsia="Times New Roman" w:cstheme="minorHAnsi"/>
+          <w:color w:val="000000" w:themeColor="text1"/>
+        </w:rPr>
+        <w:t>: Drawing data graphics typically requires vast amounts of boilerplate code. Plotly simplified this process, allowing for the generation of interactive, highly customizable charts with just a few lines of code.</w:t>
       </w:r>
     </w:p>
     <w:p>
@@ -503,39 +328,7 @@
           <w:rFonts w:eastAsia="Times New Roman" w:cstheme="minorHAnsi"/>
           <w:color w:val="000000" w:themeColor="text1"/>
         </w:rPr>
-        <w:t xml:space="preserve">: While the raw BSON data provided by MongoDB reflects a Python list of dictionaries, it must be decoded into a manipulatable format for the data table and charts. Pandas </w:t>
-      </w:r>
-      <w:proofErr w:type="gramStart"/>
-      <w:r>
-        <w:rPr>
-          <w:rFonts w:eastAsia="Times New Roman" w:cstheme="minorHAnsi"/>
-          <w:color w:val="000000" w:themeColor="text1"/>
-        </w:rPr>
-        <w:t>bridges</w:t>
-      </w:r>
-      <w:proofErr w:type="gramEnd"/>
-      <w:r>
-        <w:rPr>
-          <w:rFonts w:eastAsia="Times New Roman" w:cstheme="minorHAnsi"/>
-          <w:color w:val="000000" w:themeColor="text1"/>
-        </w:rPr>
-        <w:t xml:space="preserve"> this gap by converting the raw data into a </w:t>
-      </w:r>
-      <w:proofErr w:type="spellStart"/>
-      <w:r>
-        <w:rPr>
-          <w:rFonts w:eastAsia="Times New Roman" w:cstheme="minorHAnsi"/>
-          <w:color w:val="000000" w:themeColor="text1"/>
-        </w:rPr>
-        <w:t>DataFrame</w:t>
-      </w:r>
-      <w:proofErr w:type="spellEnd"/>
-      <w:r>
-        <w:rPr>
-          <w:rFonts w:eastAsia="Times New Roman" w:cstheme="minorHAnsi"/>
-          <w:color w:val="000000" w:themeColor="text1"/>
-        </w:rPr>
-        <w:t>, gracefully handling edge cases and making data manipulation seamless.</w:t>
+        <w:t>: While the raw BSON data provided by MongoDB reflects a Python list of dictionaries, it must be decoded into a manipulatable format for the data table and charts. Pandas bridges this gap by converting the raw data into a DataFrame, gracefully handling edge cases and making data manipulation seamless.</w:t>
       </w:r>
     </w:p>
     <w:p>
@@ -665,7 +458,6 @@
           <w:color w:val="000000" w:themeColor="text1"/>
         </w:rPr>
       </w:pPr>
-      <w:proofErr w:type="spellStart"/>
       <w:r>
         <w:rPr>
           <w:rFonts w:eastAsia="Times New Roman" w:cstheme="minorHAnsi"/>
@@ -674,40 +466,14 @@
           <w:color w:val="000000" w:themeColor="text1"/>
         </w:rPr>
         <w:lastRenderedPageBreak/>
-        <w:t>PyMongo</w:t>
-      </w:r>
-      <w:proofErr w:type="spellEnd"/>
-      <w:r>
-        <w:rPr>
-          <w:rFonts w:eastAsia="Times New Roman" w:cstheme="minorHAnsi"/>
-          <w:b/>
-          <w:bCs/>
-          <w:color w:val="000000" w:themeColor="text1"/>
-        </w:rPr>
-        <w:t>:</w:t>
-      </w:r>
-      <w:r>
-        <w:rPr>
-          <w:rFonts w:eastAsia="Times New Roman" w:cstheme="minorHAnsi"/>
-          <w:color w:val="000000" w:themeColor="text1"/>
-        </w:rPr>
-        <w:t xml:space="preserve"> (pip install </w:t>
-      </w:r>
-      <w:proofErr w:type="spellStart"/>
-      <w:r>
-        <w:rPr>
-          <w:rFonts w:eastAsia="Times New Roman" w:cstheme="minorHAnsi"/>
-          <w:color w:val="000000" w:themeColor="text1"/>
-        </w:rPr>
-        <w:t>pymongo</w:t>
-      </w:r>
-      <w:proofErr w:type="spellEnd"/>
-      <w:r>
-        <w:rPr>
-          <w:rFonts w:eastAsia="Times New Roman" w:cstheme="minorHAnsi"/>
-          <w:color w:val="000000" w:themeColor="text1"/>
-        </w:rPr>
-        <w:t>) The official MongoDB driver for Python. It enables interaction with any MongoDB database with minimal configuration.</w:t>
+        <w:t>PyMongo:</w:t>
+      </w:r>
+      <w:r>
+        <w:rPr>
+          <w:rFonts w:eastAsia="Times New Roman" w:cstheme="minorHAnsi"/>
+          <w:color w:val="000000" w:themeColor="text1"/>
+        </w:rPr>
+        <w:t xml:space="preserve"> (pip install pymongo) The official MongoDB driver for Python. It enables interaction with any MongoDB database with minimal configuration.</w:t>
       </w:r>
     </w:p>
     <w:p>
@@ -834,48 +600,21 @@
           <w:color w:val="000000" w:themeColor="text1"/>
         </w:rPr>
       </w:pPr>
-      <w:proofErr w:type="spellStart"/>
-      <w:r>
-        <w:rPr>
-          <w:rFonts w:eastAsia="Times New Roman" w:cstheme="minorHAnsi"/>
-          <w:b/>
-          <w:bCs/>
-          <w:color w:val="000000" w:themeColor="text1"/>
-        </w:rPr>
-        <w:t>Plotly</w:t>
-      </w:r>
-      <w:proofErr w:type="spellEnd"/>
-      <w:r>
-        <w:rPr>
-          <w:rFonts w:eastAsia="Times New Roman" w:cstheme="minorHAnsi"/>
-          <w:b/>
-          <w:bCs/>
-          <w:color w:val="000000" w:themeColor="text1"/>
-        </w:rPr>
-        <w:t>:</w:t>
-      </w:r>
-      <w:r>
-        <w:rPr>
-          <w:rFonts w:eastAsia="Times New Roman" w:cstheme="minorHAnsi"/>
-          <w:color w:val="000000" w:themeColor="text1"/>
-        </w:rPr>
-        <w:t xml:space="preserve"> (pip install </w:t>
-      </w:r>
-      <w:proofErr w:type="spellStart"/>
-      <w:r>
-        <w:rPr>
-          <w:rFonts w:eastAsia="Times New Roman" w:cstheme="minorHAnsi"/>
-          <w:color w:val="000000" w:themeColor="text1"/>
-        </w:rPr>
-        <w:t>plotly</w:t>
-      </w:r>
-      <w:proofErr w:type="spellEnd"/>
-      <w:r>
-        <w:rPr>
-          <w:rFonts w:eastAsia="Times New Roman" w:cstheme="minorHAnsi"/>
-          <w:color w:val="000000" w:themeColor="text1"/>
-        </w:rPr>
-        <w:t>)</w:t>
+      <w:r>
+        <w:rPr>
+          <w:rFonts w:eastAsia="Times New Roman" w:cstheme="minorHAnsi"/>
+          <w:b/>
+          <w:bCs/>
+          <w:color w:val="000000" w:themeColor="text1"/>
+        </w:rPr>
+        <w:t>Plotly:</w:t>
+      </w:r>
+      <w:r>
+        <w:rPr>
+          <w:rFonts w:eastAsia="Times New Roman" w:cstheme="minorHAnsi"/>
+          <w:color w:val="000000" w:themeColor="text1"/>
+        </w:rPr>
+        <w:t xml:space="preserve"> (pip install plotly)</w:t>
       </w:r>
     </w:p>
     <w:p>
@@ -1006,7 +745,6 @@
         </w:rPr>
         <w:t>`</w:t>
       </w:r>
-      <w:proofErr w:type="spellStart"/>
       <w:r>
         <w:rPr>
           <w:rFonts w:eastAsia="Times New Roman" w:cstheme="minorHAnsi"/>
@@ -1015,7 +753,6 @@
         </w:rPr>
         <w:t>aac</w:t>
       </w:r>
-      <w:proofErr w:type="spellEnd"/>
       <w:r>
         <w:rPr>
           <w:rFonts w:eastAsia="Times New Roman" w:cstheme="minorHAnsi"/>
@@ -1030,25 +767,7 @@
           <w:iCs/>
           <w:color w:val="000000" w:themeColor="text1"/>
         </w:rPr>
-        <w:t xml:space="preserve"> containing an </w:t>
-      </w:r>
-      <w:proofErr w:type="gramStart"/>
-      <w:r>
-        <w:rPr>
-          <w:rFonts w:eastAsia="Times New Roman" w:cstheme="minorHAnsi"/>
-          <w:iCs/>
-          <w:color w:val="000000" w:themeColor="text1"/>
-        </w:rPr>
-        <w:t>animals</w:t>
-      </w:r>
-      <w:proofErr w:type="gramEnd"/>
-      <w:r>
-        <w:rPr>
-          <w:rFonts w:eastAsia="Times New Roman" w:cstheme="minorHAnsi"/>
-          <w:iCs/>
-          <w:color w:val="000000" w:themeColor="text1"/>
-        </w:rPr>
-        <w:t xml:space="preserve"> collection. </w:t>
+        <w:t xml:space="preserve"> containing an animals collection. </w:t>
       </w:r>
     </w:p>
     <w:p>
@@ -1176,7 +895,6 @@
         </w:rPr>
         <w:t>`</w:t>
       </w:r>
-      <w:proofErr w:type="spellStart"/>
       <w:r>
         <w:rPr>
           <w:rFonts w:eastAsia="Times New Roman" w:cstheme="minorHAnsi"/>
@@ -1185,7 +903,6 @@
         </w:rPr>
         <w:t>mongosh</w:t>
       </w:r>
-      <w:proofErr w:type="spellEnd"/>
       <w:r>
         <w:rPr>
           <w:rFonts w:eastAsia="Times New Roman" w:cstheme="minorHAnsi"/>
@@ -1210,7 +927,6 @@
         </w:rPr>
         <w:t>`</w:t>
       </w:r>
-      <w:proofErr w:type="spellStart"/>
       <w:r>
         <w:rPr>
           <w:rFonts w:eastAsia="Times New Roman" w:cstheme="minorHAnsi"/>
@@ -1219,7 +935,6 @@
         </w:rPr>
         <w:t>readWrite</w:t>
       </w:r>
-      <w:proofErr w:type="spellEnd"/>
       <w:r>
         <w:rPr>
           <w:rFonts w:eastAsia="Times New Roman" w:cstheme="minorHAnsi"/>
@@ -1244,7 +959,6 @@
         </w:rPr>
         <w:t>`</w:t>
       </w:r>
-      <w:proofErr w:type="spellStart"/>
       <w:r>
         <w:rPr>
           <w:rFonts w:eastAsia="Times New Roman" w:cstheme="minorHAnsi"/>
@@ -1253,7 +967,6 @@
         </w:rPr>
         <w:t>aac</w:t>
       </w:r>
-      <w:proofErr w:type="spellEnd"/>
       <w:r>
         <w:rPr>
           <w:rFonts w:eastAsia="Times New Roman" w:cstheme="minorHAnsi"/>
@@ -1311,16 +1024,7 @@
           <w:iCs/>
           <w:color w:val="000000" w:themeColor="text1"/>
         </w:rPr>
-        <w:t xml:space="preserve">Open the </w:t>
-      </w:r>
-      <w:proofErr w:type="spellStart"/>
-      <w:r>
-        <w:rPr>
-          <w:rFonts w:eastAsia="Times New Roman" w:cstheme="minorHAnsi"/>
-          <w:iCs/>
-          <w:color w:val="000000" w:themeColor="text1"/>
-        </w:rPr>
-        <w:t>J</w:t>
+        <w:t>Open the J</w:t>
       </w:r>
       <w:r>
         <w:rPr>
@@ -1336,18 +1040,8 @@
           <w:iCs/>
           <w:color w:val="000000" w:themeColor="text1"/>
         </w:rPr>
-        <w:t>ypter</w:t>
-      </w:r>
-      <w:proofErr w:type="spellEnd"/>
-      <w:r>
-        <w:rPr>
-          <w:rFonts w:eastAsia="Times New Roman" w:cstheme="minorHAnsi"/>
-          <w:iCs/>
-          <w:color w:val="000000" w:themeColor="text1"/>
-        </w:rPr>
-        <w:t xml:space="preserve"> notebook file (`</w:t>
-      </w:r>
-      <w:proofErr w:type="spellStart"/>
+        <w:t>ypter notebook file (`</w:t>
+      </w:r>
       <w:r>
         <w:rPr>
           <w:rFonts w:eastAsia="Times New Roman" w:cstheme="minorHAnsi"/>
@@ -1356,32 +1050,13 @@
         </w:rPr>
         <w:t>ProjectTwoDashboard.ipynb</w:t>
       </w:r>
-      <w:proofErr w:type="spellEnd"/>
-      <w:r>
-        <w:rPr>
-          <w:rFonts w:eastAsia="Times New Roman" w:cstheme="minorHAnsi"/>
-          <w:iCs/>
-          <w:color w:val="000000" w:themeColor="text1"/>
-        </w:rPr>
-        <w:t>`</w:t>
-      </w:r>
-      <w:proofErr w:type="gramStart"/>
-      <w:r>
-        <w:rPr>
-          <w:rFonts w:eastAsia="Times New Roman" w:cstheme="minorHAnsi"/>
-          <w:iCs/>
-          <w:color w:val="000000" w:themeColor="text1"/>
-        </w:rPr>
-        <w:t>), and</w:t>
-      </w:r>
-      <w:proofErr w:type="gramEnd"/>
-      <w:r>
-        <w:rPr>
-          <w:rFonts w:eastAsia="Times New Roman" w:cstheme="minorHAnsi"/>
-          <w:iCs/>
-          <w:color w:val="000000" w:themeColor="text1"/>
-        </w:rPr>
-        <w:t xml:space="preserve"> run the file. Please note that it must be in the same directory as Python_CRUD_Module.py.</w:t>
+      <w:r>
+        <w:rPr>
+          <w:rFonts w:eastAsia="Times New Roman" w:cstheme="minorHAnsi"/>
+          <w:iCs/>
+          <w:color w:val="000000" w:themeColor="text1"/>
+        </w:rPr>
+        <w:t>`), and run the file. Please note that it must be in the same directory as Python_CRUD_Module.py.</w:t>
       </w:r>
     </w:p>
     <w:p>
@@ -1581,43 +1256,7 @@
           <w:iCs/>
           <w:color w:val="000000" w:themeColor="text1"/>
         </w:rPr>
-        <w:t xml:space="preserve">: The MongoDB DAO was tested in an isolated Jupyter Notebook environment. Direct CRUD operations were executed against the </w:t>
-      </w:r>
-      <w:proofErr w:type="spellStart"/>
-      <w:r>
-        <w:rPr>
-          <w:rFonts w:eastAsia="Times New Roman" w:cstheme="minorHAnsi"/>
-          <w:iCs/>
-          <w:color w:val="000000" w:themeColor="text1"/>
-        </w:rPr>
-        <w:t>aac</w:t>
-      </w:r>
-      <w:proofErr w:type="spellEnd"/>
-      <w:r>
-        <w:rPr>
-          <w:rFonts w:eastAsia="Times New Roman" w:cstheme="minorHAnsi"/>
-          <w:iCs/>
-          <w:color w:val="000000" w:themeColor="text1"/>
-        </w:rPr>
-        <w:t xml:space="preserve"> database to verify that the </w:t>
-      </w:r>
-      <w:proofErr w:type="spellStart"/>
-      <w:r>
-        <w:rPr>
-          <w:rFonts w:eastAsia="Times New Roman" w:cstheme="minorHAnsi"/>
-          <w:iCs/>
-          <w:color w:val="000000" w:themeColor="text1"/>
-        </w:rPr>
-        <w:t>PyMongo</w:t>
-      </w:r>
-      <w:proofErr w:type="spellEnd"/>
-      <w:r>
-        <w:rPr>
-          <w:rFonts w:eastAsia="Times New Roman" w:cstheme="minorHAnsi"/>
-          <w:iCs/>
-          <w:color w:val="000000" w:themeColor="text1"/>
-        </w:rPr>
-        <w:t xml:space="preserve"> cursor conversions and exception handling behaved gracefully without crashing the application. </w:t>
+        <w:t xml:space="preserve">: The MongoDB DAO was tested in an isolated Jupyter Notebook environment. Direct CRUD operations were executed against the aac database to verify that the PyMongo cursor conversions and exception handling behaved gracefully without crashing the application. </w:t>
       </w:r>
     </w:p>
     <w:p>
@@ -1651,25 +1290,7 @@
           <w:iCs/>
           <w:color w:val="000000" w:themeColor="text1"/>
         </w:rPr>
-        <w:t xml:space="preserve">: Manual system testing was performed on the Dash framework. This included verifying that the </w:t>
-      </w:r>
-      <w:proofErr w:type="spellStart"/>
-      <w:r>
-        <w:rPr>
-          <w:rFonts w:eastAsia="Times New Roman" w:cstheme="minorHAnsi"/>
-          <w:iCs/>
-          <w:color w:val="000000" w:themeColor="text1"/>
-        </w:rPr>
-        <w:t>Plotly</w:t>
-      </w:r>
-      <w:proofErr w:type="spellEnd"/>
-      <w:r>
-        <w:rPr>
-          <w:rFonts w:eastAsia="Times New Roman" w:cstheme="minorHAnsi"/>
-          <w:iCs/>
-          <w:color w:val="000000" w:themeColor="text1"/>
-        </w:rPr>
-        <w:t xml:space="preserve"> Express charts and data tables updated dynamically and synchronously when specific rescue mission filters (e.g., Water Rescue, Mountain Rescue) were toggled via user input. Layout responsiveness was also validated using the Dash Bootstrap Components grid system. </w:t>
+        <w:t xml:space="preserve">: Manual system testing was performed on the Dash framework. This included verifying that the Plotly Express charts and data tables updated dynamically and synchronously when specific rescue mission filters (e.g., Water Rescue, Mountain Rescue) were toggled via user input. Layout responsiveness was also validated using the Dash Bootstrap Components grid system. </w:t>
       </w:r>
     </w:p>
     <w:p>
@@ -2210,43 +1831,7 @@
           <w:iCs/>
           <w:color w:val="000000" w:themeColor="text1"/>
         </w:rPr>
-        <w:t xml:space="preserve">The first step in this </w:t>
-      </w:r>
-      <w:proofErr w:type="gramStart"/>
-      <w:r>
-        <w:rPr>
-          <w:rFonts w:eastAsia="Times New Roman" w:cstheme="minorHAnsi"/>
-          <w:iCs/>
-          <w:color w:val="000000" w:themeColor="text1"/>
-        </w:rPr>
-        <w:t>development</w:t>
-      </w:r>
-      <w:proofErr w:type="gramEnd"/>
-      <w:r>
-        <w:rPr>
-          <w:rFonts w:eastAsia="Times New Roman" w:cstheme="minorHAnsi"/>
-          <w:iCs/>
-          <w:color w:val="000000" w:themeColor="text1"/>
-        </w:rPr>
-        <w:t xml:space="preserve"> lifecycle was to complete the MongoDB driver (the DAO) during Project One. This aimed to bridge the gap between direct MongoDB manipulation and Python using the official </w:t>
-      </w:r>
-      <w:proofErr w:type="spellStart"/>
-      <w:r>
-        <w:rPr>
-          <w:rFonts w:eastAsia="Times New Roman" w:cstheme="minorHAnsi"/>
-          <w:iCs/>
-          <w:color w:val="000000" w:themeColor="text1"/>
-        </w:rPr>
-        <w:t>PyMongo</w:t>
-      </w:r>
-      <w:proofErr w:type="spellEnd"/>
-      <w:r>
-        <w:rPr>
-          <w:rFonts w:eastAsia="Times New Roman" w:cstheme="minorHAnsi"/>
-          <w:iCs/>
-          <w:color w:val="000000" w:themeColor="text1"/>
-        </w:rPr>
-        <w:t xml:space="preserve"> driver. It encapsulates the inner workings and handles edge cases gracefully, providing a layer of abstraction and decoupling that allows the backend code to be updated without breaking the frontend.</w:t>
+        <w:t>The first step in this development lifecycle was to complete the MongoDB driver (the DAO) during Project One. This aimed to bridge the gap between direct MongoDB manipulation and Python using the official PyMongo driver. It encapsulates the inner workings and handles edge cases gracefully, providing a layer of abstraction and decoupling that allows the backend code to be updated without breaking the frontend.</w:t>
       </w:r>
     </w:p>
     <w:p>
@@ -2265,25 +1850,7 @@
           <w:iCs/>
           <w:color w:val="000000" w:themeColor="text1"/>
         </w:rPr>
-        <w:t xml:space="preserve">The next step was to </w:t>
-      </w:r>
-      <w:proofErr w:type="gramStart"/>
-      <w:r>
-        <w:rPr>
-          <w:rFonts w:eastAsia="Times New Roman" w:cstheme="minorHAnsi"/>
-          <w:iCs/>
-          <w:color w:val="000000" w:themeColor="text1"/>
-        </w:rPr>
-        <w:t>architect</w:t>
-      </w:r>
-      <w:proofErr w:type="gramEnd"/>
-      <w:r>
-        <w:rPr>
-          <w:rFonts w:eastAsia="Times New Roman" w:cstheme="minorHAnsi"/>
-          <w:iCs/>
-          <w:color w:val="000000" w:themeColor="text1"/>
-        </w:rPr>
-        <w:t xml:space="preserve"> the frontend dashboard. To overcome the initial learning curve of Dash, I referenced external tutorials to understand component routing. Initially, it was unintuitive that callbacks are invoked indirectly via component IDs rather than direct function calls. I then applied a Bootstrap theme to modernize the UI. Finally, to ensure all client criteria were met, I performed manual testing on all interactive filtering and data rendering options.</w:t>
+        <w:t>The next step was to architect the frontend dashboard. To overcome the initial learning curve of Dash, I referenced external tutorials to understand component routing. Initially, it was unintuitive that callbacks are invoked indirectly via component IDs rather than direct function calls. I then applied a Bootstrap theme to modernize the UI. Finally, to ensure all client criteria were met, I performed manual testing on all interactive filtering and data rendering options.</w:t>
       </w:r>
     </w:p>
     <w:p>
@@ -2323,51 +1890,23 @@
           <w:iCs/>
           <w:color w:val="000000" w:themeColor="text1"/>
         </w:rPr>
-        <w:t xml:space="preserve">During the development of the CRUD module's read method, a primary challenge involved handling return types from the </w:t>
-      </w:r>
-      <w:proofErr w:type="spellStart"/>
+        <w:t xml:space="preserve">During the development of the CRUD module's read method, a primary challenge involved handling return types from the PyMongo driver. Specifically, the </w:t>
+      </w:r>
       <w:r>
         <w:rPr>
           <w:rFonts w:ascii="Calibri" w:eastAsia="Times New Roman" w:hAnsi="Calibri" w:cstheme="minorHAnsi"/>
           <w:iCs/>
           <w:color w:val="000000" w:themeColor="text1"/>
         </w:rPr>
-        <w:t>PyMongo</w:t>
-      </w:r>
-      <w:proofErr w:type="spellEnd"/>
+        <w:t>`</w:t>
+      </w:r>
       <w:r>
         <w:rPr>
           <w:rFonts w:ascii="Calibri" w:eastAsia="Times New Roman" w:hAnsi="Calibri" w:cstheme="minorHAnsi"/>
           <w:iCs/>
           <w:color w:val="000000" w:themeColor="text1"/>
         </w:rPr>
-        <w:t xml:space="preserve"> driver. Specifically, the </w:t>
-      </w:r>
-      <w:r>
-        <w:rPr>
-          <w:rFonts w:ascii="Calibri" w:eastAsia="Times New Roman" w:hAnsi="Calibri" w:cstheme="minorHAnsi"/>
-          <w:iCs/>
-          <w:color w:val="000000" w:themeColor="text1"/>
-        </w:rPr>
-        <w:t>`</w:t>
-      </w:r>
-      <w:proofErr w:type="gramStart"/>
-      <w:r>
-        <w:rPr>
-          <w:rFonts w:ascii="Calibri" w:eastAsia="Times New Roman" w:hAnsi="Calibri" w:cstheme="minorHAnsi"/>
-          <w:iCs/>
-          <w:color w:val="000000" w:themeColor="text1"/>
-        </w:rPr>
-        <w:t>find(</w:t>
-      </w:r>
-      <w:proofErr w:type="gramEnd"/>
-      <w:r>
-        <w:rPr>
-          <w:rFonts w:ascii="Calibri" w:eastAsia="Times New Roman" w:hAnsi="Calibri" w:cstheme="minorHAnsi"/>
-          <w:iCs/>
-          <w:color w:val="000000" w:themeColor="text1"/>
-        </w:rPr>
-        <w:t>)</w:t>
+        <w:t>find()</w:t>
       </w:r>
       <w:r>
         <w:rPr>
@@ -2442,25 +1981,7 @@
           <w:iCs/>
           <w:color w:val="000000" w:themeColor="text1"/>
         </w:rPr>
-        <w:t>ue to the high density of categorical data in the initial dataset, the requested pie chart was rendering too small and becoming unreadable. I solved this UX issue by switching the chart's target metric to "Outcome After Service" (</w:t>
-      </w:r>
-      <w:proofErr w:type="spellStart"/>
-      <w:r>
-        <w:rPr>
-          <w:rFonts w:ascii="Calibri" w:eastAsia="Times New Roman" w:hAnsi="Calibri" w:cstheme="minorHAnsi"/>
-          <w:iCs/>
-          <w:color w:val="000000" w:themeColor="text1"/>
-        </w:rPr>
-        <w:t>outcome_type</w:t>
-      </w:r>
-      <w:proofErr w:type="spellEnd"/>
-      <w:r>
-        <w:rPr>
-          <w:rFonts w:ascii="Calibri" w:eastAsia="Times New Roman" w:hAnsi="Calibri" w:cstheme="minorHAnsi"/>
-          <w:iCs/>
-          <w:color w:val="000000" w:themeColor="text1"/>
-        </w:rPr>
-        <w:t>), resulting in a much cleaner and more readable visualization for the end user.</w:t>
+        <w:t>ue to the high density of categorical data in the initial dataset, the requested pie chart was rendering too small and becoming unreadable. I solved this UX issue by switching the chart's target metric to "Outcome After Service" (outcome_type), resulting in a much cleaner and more readable visualization for the end user.</w:t>
       </w:r>
     </w:p>
     <w:p>
@@ -5378,6 +4899,15 @@
 </file>
 
 <file path=customXml/item2.xml><?xml version="1.0" encoding="utf-8"?>
+<?mso-contentType ?>
+<FormTemplates xmlns="http://schemas.microsoft.com/sharepoint/v3/contenttype/forms">
+  <Display>DocumentLibraryForm</Display>
+  <Edit>DocumentLibraryForm</Edit>
+  <New>DocumentLibraryForm</New>
+</FormTemplates>
+</file>
+
+<file path=customXml/item3.xml><?xml version="1.0" encoding="utf-8"?>
 <ct:contentTypeSchema xmlns:ct="http://schemas.microsoft.com/office/2006/metadata/contentType" xmlns:ma="http://schemas.microsoft.com/office/2006/metadata/properties/metaAttributes" ct:_="" ma:_="" ma:contentTypeName="Document" ma:contentTypeID="0x01010019267F6D1A260A4394C18F5AF72445EA" ma:contentTypeVersion="3" ma:contentTypeDescription="Create a new document." ma:contentTypeScope="" ma:versionID="d6a723735a0ade9a92961b83aee31dda">
   <xsd:schema xmlns:xsd="http://www.w3.org/2001/XMLSchema" xmlns:xs="http://www.w3.org/2001/XMLSchema" xmlns:p="http://schemas.microsoft.com/office/2006/metadata/properties" targetNamespace="http://schemas.microsoft.com/office/2006/metadata/properties" ma:root="true" ma:fieldsID="e345bd7673956a623930e5662e321f3a">
     <xsd:element name="properties">
@@ -5491,15 +5021,6 @@
 </ct:contentTypeSchema>
 </file>
 
-<file path=customXml/item3.xml><?xml version="1.0" encoding="utf-8"?>
-<?mso-contentType ?>
-<FormTemplates xmlns="http://schemas.microsoft.com/sharepoint/v3/contenttype/forms">
-  <Display>DocumentLibraryForm</Display>
-  <Edit>DocumentLibraryForm</Edit>
-  <New>DocumentLibraryForm</New>
-</FormTemplates>
-</file>
-
 <file path=customXml/itemProps1.xml><?xml version="1.0" encoding="utf-8"?>
 <ds:datastoreItem xmlns:ds="http://schemas.openxmlformats.org/officeDocument/2006/customXml" ds:itemID="{EFABB13D-A66E-491F-BA60-CC9FCE34966D}">
   <ds:schemaRefs>
@@ -5510,6 +5031,14 @@
 </file>
 
 <file path=customXml/itemProps2.xml><?xml version="1.0" encoding="utf-8"?>
+<ds:datastoreItem xmlns:ds="http://schemas.openxmlformats.org/officeDocument/2006/customXml" ds:itemID="{1F921303-C45E-4313-B077-FAAB1A70E5C4}">
+  <ds:schemaRefs>
+    <ds:schemaRef ds:uri="http://schemas.microsoft.com/sharepoint/v3/contenttype/forms"/>
+  </ds:schemaRefs>
+</ds:datastoreItem>
+</file>
+
+<file path=customXml/itemProps3.xml><?xml version="1.0" encoding="utf-8"?>
 <ds:datastoreItem xmlns:ds="http://schemas.openxmlformats.org/officeDocument/2006/customXml" ds:itemID="{DE1FBD17-C71E-4B14-BDF1-6D676B7B7931}">
   <ds:schemaRefs>
     <ds:schemaRef ds:uri="http://schemas.microsoft.com/office/2006/metadata/contentType"/>
@@ -5523,12 +5052,4 @@
     <ds:schemaRef ds:uri="http://schemas.microsoft.com/office/infopath/2007/PartnerControls"/>
   </ds:schemaRefs>
 </ds:datastoreItem>
-</file>
-
-<file path=customXml/itemProps3.xml><?xml version="1.0" encoding="utf-8"?>
-<ds:datastoreItem xmlns:ds="http://schemas.openxmlformats.org/officeDocument/2006/customXml" ds:itemID="{1F921303-C45E-4313-B077-FAAB1A70E5C4}">
-  <ds:schemaRefs>
-    <ds:schemaRef ds:uri="http://schemas.microsoft.com/sharepoint/v3/contenttype/forms"/>
-  </ds:schemaRefs>
-</ds:datastoreItem>
 </file>
</xml_diff>